<commit_message>
Update dialogue review document with final NPC identities
</commit_message>
<xml_diff>
--- a/unity/StorytellingVR/Docs/Level1_Hampi_Dialogue_Review.docx
+++ b/unity/StorytellingVR/Docs/Level1_Hampi_Dialogue_Review.docx
@@ -104,7 +104,7 @@
           <w:b w:val="0"/>
           <w:sz w:val="22"/>
         </w:rPr>
-        <w:t>Ignore placeholders such as {spiceName} and {quantityLabel}; the game replaces those dynamically at runtime.</w:t>
+        <w:t>Ignore placeholders such as {spiceName}, {quantityLabel}, {currentBuyerOffer}, {currency}, {offeredPrice}, {counterPrice}, and {finalPrice}; the game replaces those dynamically at runtime.</w:t>
       </w:r>
     </w:p>
     <w:p>
@@ -235,6 +235,66 @@
                 <w:rFonts w:ascii="Calibri" w:hAnsi="Calibri"/>
                 <w:sz w:val="22"/>
               </w:rPr>
+              <w:t>{currentBuyerOffer}</w:t>
+            </w:r>
+          </w:p>
+        </w:tc>
+        <w:tc>
+          <w:tcPr>
+            <w:tcW w:type="dxa" w:w="4824"/>
+          </w:tcPr>
+          <w:p>
+            <w:r>
+              <w:rPr>
+                <w:rFonts w:ascii="Calibri" w:hAnsi="Calibri"/>
+                <w:sz w:val="22"/>
+              </w:rPr>
+              <w:t>buyer offer amount</w:t>
+            </w:r>
+          </w:p>
+        </w:tc>
+      </w:tr>
+      <w:tr>
+        <w:tc>
+          <w:tcPr>
+            <w:tcW w:type="dxa" w:w="4824"/>
+          </w:tcPr>
+          <w:p>
+            <w:r>
+              <w:rPr>
+                <w:rFonts w:ascii="Calibri" w:hAnsi="Calibri"/>
+                <w:sz w:val="22"/>
+              </w:rPr>
+              <w:t>{currency}</w:t>
+            </w:r>
+          </w:p>
+        </w:tc>
+        <w:tc>
+          <w:tcPr>
+            <w:tcW w:type="dxa" w:w="4824"/>
+          </w:tcPr>
+          <w:p>
+            <w:r>
+              <w:rPr>
+                <w:rFonts w:ascii="Calibri" w:hAnsi="Calibri"/>
+                <w:sz w:val="22"/>
+              </w:rPr>
+              <w:t>money unit</w:t>
+            </w:r>
+          </w:p>
+        </w:tc>
+      </w:tr>
+      <w:tr>
+        <w:tc>
+          <w:tcPr>
+            <w:tcW w:type="dxa" w:w="4824"/>
+          </w:tcPr>
+          <w:p>
+            <w:r>
+              <w:rPr>
+                <w:rFonts w:ascii="Calibri" w:hAnsi="Calibri"/>
+                <w:sz w:val="22"/>
+              </w:rPr>
               <w:t>{offeredPrice}</w:t>
             </w:r>
           </w:p>
@@ -314,36 +374,6 @@
           </w:p>
         </w:tc>
       </w:tr>
-      <w:tr>
-        <w:tc>
-          <w:tcPr>
-            <w:tcW w:type="dxa" w:w="4824"/>
-          </w:tcPr>
-          <w:p>
-            <w:r>
-              <w:rPr>
-                <w:rFonts w:ascii="Calibri" w:hAnsi="Calibri"/>
-                <w:sz w:val="22"/>
-              </w:rPr>
-              <w:t>{currency}</w:t>
-            </w:r>
-          </w:p>
-        </w:tc>
-        <w:tc>
-          <w:tcPr>
-            <w:tcW w:type="dxa" w:w="4824"/>
-          </w:tcPr>
-          <w:p>
-            <w:r>
-              <w:rPr>
-                <w:rFonts w:ascii="Calibri" w:hAnsi="Calibri"/>
-                <w:sz w:val="22"/>
-              </w:rPr>
-              <w:t>money unit</w:t>
-            </w:r>
-          </w:p>
-        </w:tc>
-      </w:tr>
     </w:tbl>
     <w:p/>
     <w:p>
@@ -377,7 +407,7 @@
           <w:b w:val="0"/>
           <w:sz w:val="22"/>
         </w:rPr>
-        <w:t>An Arab caravan trader moving through Hampi as part of the long-distance spice trade across inland routes.</w:t>
+        <w:t>A foreign caravan trader moving through Hampi as part of the long-distance spice trade across inland routes.</w:t>
       </w:r>
     </w:p>
     <w:p>
@@ -411,6 +441,27 @@
           <w:b/>
           <w:sz w:val="22"/>
         </w:rPr>
+        <w:t xml:space="preserve">Voice Direction: </w:t>
+      </w:r>
+      <w:r>
+        <w:rPr>
+          <w:rFonts w:ascii="Calibri" w:hAnsi="Calibri"/>
+          <w:b w:val="0"/>
+          <w:sz w:val="22"/>
+        </w:rPr>
+        <w:t>Male voice. Foreign caravan trader tone.</w:t>
+      </w:r>
+    </w:p>
+    <w:p>
+      <w:pPr>
+        <w:spacing w:after="80"/>
+      </w:pPr>
+      <w:r>
+        <w:rPr>
+          <w:rFonts w:ascii="Calibri" w:hAnsi="Calibri"/>
+          <w:b/>
+          <w:sz w:val="22"/>
+        </w:rPr>
         <w:t xml:space="preserve">Review Goal: </w:t>
       </w:r>
       <w:r>
@@ -419,7 +470,7 @@
           <w:b w:val="0"/>
           <w:sz w:val="22"/>
         </w:rPr>
-        <w:t>Check whether he sounds like an experienced Arab trader whose voice reflects caravans, trade routes, trust, and reputation.</w:t>
+        <w:t>Check whether he sounds like an experienced caravan trader whose voice reflects travel, trade routes, trust, and reputation.</w:t>
       </w:r>
     </w:p>
     <w:p>
@@ -3843,6 +3894,27 @@
           <w:b/>
           <w:sz w:val="22"/>
         </w:rPr>
+        <w:t xml:space="preserve">Voice Direction: </w:t>
+      </w:r>
+      <w:r>
+        <w:rPr>
+          <w:rFonts w:ascii="Calibri" w:hAnsi="Calibri"/>
+          <w:b w:val="0"/>
+          <w:sz w:val="22"/>
+        </w:rPr>
+        <w:t>Male European or British-style voice.</w:t>
+      </w:r>
+    </w:p>
+    <w:p>
+      <w:pPr>
+        <w:spacing w:after="80"/>
+      </w:pPr>
+      <w:r>
+        <w:rPr>
+          <w:rFonts w:ascii="Calibri" w:hAnsi="Calibri"/>
+          <w:b/>
+          <w:sz w:val="22"/>
+        </w:rPr>
         <w:t xml:space="preserve">Review Goal: </w:t>
       </w:r>
       <w:r>
@@ -6491,6 +6563,27 @@
           <w:b/>
           <w:sz w:val="22"/>
         </w:rPr>
+        <w:t xml:space="preserve">Voice Direction: </w:t>
+      </w:r>
+      <w:r>
+        <w:rPr>
+          <w:rFonts w:ascii="Calibri" w:hAnsi="Calibri"/>
+          <w:b w:val="0"/>
+          <w:sz w:val="22"/>
+        </w:rPr>
+        <w:t>Indian English female voice.</w:t>
+      </w:r>
+    </w:p>
+    <w:p>
+      <w:pPr>
+        <w:spacing w:after="80"/>
+      </w:pPr>
+      <w:r>
+        <w:rPr>
+          <w:rFonts w:ascii="Calibri" w:hAnsi="Calibri"/>
+          <w:b/>
+          <w:sz w:val="22"/>
+        </w:rPr>
         <w:t xml:space="preserve">Review Goal: </w:t>
       </w:r>
       <w:r>
@@ -9672,7 +9765,7 @@
           <w:b/>
           <w:sz w:val="32"/>
         </w:rPr>
-        <w:t>Chinappa Naik</w:t>
+        <w:t>Chinnamma Naik</w:t>
       </w:r>
     </w:p>
     <w:p>
@@ -9693,7 +9786,7 @@
           <w:b w:val="0"/>
           <w:sz w:val="22"/>
         </w:rPr>
-        <w:t>A Vijayanagara wholesale buyer and market authority figure tied to large orders and the commercial discipline of the royal city.</w:t>
+        <w:t>A senior Vijayanagara wholesale spice buyer working large accounts in the royal city.</w:t>
       </w:r>
     </w:p>
     <w:p>
@@ -9714,7 +9807,7 @@
           <w:b w:val="0"/>
           <w:sz w:val="22"/>
         </w:rPr>
-        <w:t>Authoritative, efficient, strict, and businesslike. He speaks with the weight of warehouses, standards, and large-scale trade.</w:t>
+        <w:t>A respected and experienced merchant woman. She is a strict negotiator who values fair trade and discipline.</w:t>
       </w:r>
     </w:p>
     <w:p>
@@ -9727,6 +9820,27 @@
           <w:b/>
           <w:sz w:val="22"/>
         </w:rPr>
+        <w:t xml:space="preserve">Voice Direction: </w:t>
+      </w:r>
+      <w:r>
+        <w:rPr>
+          <w:rFonts w:ascii="Calibri" w:hAnsi="Calibri"/>
+          <w:b w:val="0"/>
+          <w:sz w:val="22"/>
+        </w:rPr>
+        <w:t>Indian English female voice. Confident, mature, authoritative.</w:t>
+      </w:r>
+    </w:p>
+    <w:p>
+      <w:pPr>
+        <w:spacing w:after="80"/>
+      </w:pPr>
+      <w:r>
+        <w:rPr>
+          <w:rFonts w:ascii="Calibri" w:hAnsi="Calibri"/>
+          <w:b/>
+          <w:sz w:val="22"/>
+        </w:rPr>
         <w:t xml:space="preserve">Review Goal: </w:t>
       </w:r>
       <w:r>
@@ -9735,7 +9849,7 @@
           <w:b w:val="0"/>
           <w:sz w:val="22"/>
         </w:rPr>
-        <w:t>Check whether he feels clearly distinct as a high-status wholesale buyer whose voice carries authority, order, and large trade concerns.</w:t>
+        <w:t>Check whether she feels clearly distinct as a high-status wholesale merchant woman whose voice carries authority, fairness, and market discipline.</w:t>
       </w:r>
     </w:p>
     <w:p>
@@ -9762,21 +9876,21 @@
           <w:b w:val="0"/>
           <w:sz w:val="22"/>
         </w:rPr>
-        <w:t>Chinappa Naik has come for {quantityLabel} of {spiceName}. Let us weigh words as carefully as goods.</w:t>
-      </w:r>
-    </w:p>
-    <w:p>
-      <w:pPr>
-        <w:pStyle w:val="ListBullet"/>
-        <w:spacing w:after="0"/>
-      </w:pPr>
-      <w:r>
-        <w:rPr>
-          <w:rFonts w:ascii="Calibri" w:hAnsi="Calibri"/>
-          <w:b w:val="0"/>
-          <w:sz w:val="22"/>
-        </w:rPr>
-        <w:t>I am Chinappa Naik, buying for larger accounts. Show me a sensible path to {quantityLabel} of {spiceName}.</w:t>
+        <w:t>Chinnamma Naik has come for {quantityLabel} of {spiceName}. Let us weigh words as carefully as goods.</w:t>
+      </w:r>
+    </w:p>
+    <w:p>
+      <w:pPr>
+        <w:pStyle w:val="ListBullet"/>
+        <w:spacing w:after="0"/>
+      </w:pPr>
+      <w:r>
+        <w:rPr>
+          <w:rFonts w:ascii="Calibri" w:hAnsi="Calibri"/>
+          <w:b w:val="0"/>
+          <w:sz w:val="22"/>
+        </w:rPr>
+        <w:t>I am Chinnamma Naik, buying for larger accounts. Show me a sensible path to {quantityLabel} of {spiceName}.</w:t>
       </w:r>
     </w:p>
     <w:p>
@@ -9804,7 +9918,7 @@
           <w:b w:val="0"/>
           <w:sz w:val="22"/>
         </w:rPr>
-        <w:t>Chinappa Naik stands here for bulk purchase. Speak clearly on {spiceName}.</w:t>
+        <w:t>Chinnamma Naik stands here for bulk purchase. Speak clearly on {spiceName}.</w:t>
       </w:r>
     </w:p>
     <w:p>
@@ -12894,7 +13008,7 @@
           <w:b/>
           <w:sz w:val="32"/>
         </w:rPr>
-        <w:t>Siddharth Chetti</w:t>
+        <w:t>Saraswati Chetti</w:t>
       </w:r>
     </w:p>
     <w:p>
@@ -12915,7 +13029,7 @@
           <w:b w:val="0"/>
           <w:sz w:val="22"/>
         </w:rPr>
-        <w:t>A local shopkeeper who buys with resale in mind and knows the pace, chatter, and customer flow of the Hampi bazaar.</w:t>
+        <w:t>A local Vijayanagara retail shop owner who buys with resale in mind and knows the pace of the Hampi bazaar.</w:t>
       </w:r>
     </w:p>
     <w:p>
@@ -12936,7 +13050,7 @@
           <w:b w:val="0"/>
           <w:sz w:val="22"/>
         </w:rPr>
-        <w:t>Friendly, clever, lively, and practical. He sounds like someone used to quick decisions, repeat customers, and everyday bazaar business.</w:t>
+        <w:t>A friendly and knowledgeable merchant woman. She is energetic, approachable, and community-focused in the way she speaks and bargains.</w:t>
       </w:r>
     </w:p>
     <w:p>
@@ -12949,6 +13063,27 @@
           <w:b/>
           <w:sz w:val="22"/>
         </w:rPr>
+        <w:t xml:space="preserve">Voice Direction: </w:t>
+      </w:r>
+      <w:r>
+        <w:rPr>
+          <w:rFonts w:ascii="Calibri" w:hAnsi="Calibri"/>
+          <w:b w:val="0"/>
+          <w:sz w:val="22"/>
+        </w:rPr>
+        <w:t>Indian English female voice. Warm, expressive, conversational.</w:t>
+      </w:r>
+    </w:p>
+    <w:p>
+      <w:pPr>
+        <w:spacing w:after="80"/>
+      </w:pPr>
+      <w:r>
+        <w:rPr>
+          <w:rFonts w:ascii="Calibri" w:hAnsi="Calibri"/>
+          <w:b/>
+          <w:sz w:val="22"/>
+        </w:rPr>
         <w:t xml:space="preserve">Review Goal: </w:t>
       </w:r>
       <w:r>
@@ -12957,7 +13092,7 @@
           <w:b w:val="0"/>
           <w:sz w:val="22"/>
         </w:rPr>
-        <w:t>Check whether he feels like a lively local shopkeeper whose voice reflects customers, resale thinking, and bazaar life.</w:t>
+        <w:t>Check whether she feels like a lively local shop owner whose voice reflects customers, resale thinking, and community life.</w:t>
       </w:r>
     </w:p>
     <w:p>
@@ -12984,21 +13119,21 @@
           <w:b w:val="0"/>
           <w:sz w:val="22"/>
         </w:rPr>
-        <w:t>Greetings, merchant. Siddharth Chetti seeks {quantityLabel} of {spiceName} for the bazaar trade.</w:t>
-      </w:r>
-    </w:p>
-    <w:p>
-      <w:pPr>
-        <w:pStyle w:val="ListBullet"/>
-        <w:spacing w:after="0"/>
-      </w:pPr>
-      <w:r>
-        <w:rPr>
-          <w:rFonts w:ascii="Calibri" w:hAnsi="Calibri"/>
-          <w:b w:val="0"/>
-          <w:sz w:val="22"/>
-        </w:rPr>
-        <w:t>I am Siddharth Chetti, and I have come for {quantityLabel} of {spiceName} to fill my shop jars.</w:t>
+        <w:t>Greetings, merchant. Saraswati Chetti seeks {quantityLabel} of {spiceName} for the bazaar trade.</w:t>
+      </w:r>
+    </w:p>
+    <w:p>
+      <w:pPr>
+        <w:pStyle w:val="ListBullet"/>
+        <w:spacing w:after="0"/>
+      </w:pPr>
+      <w:r>
+        <w:rPr>
+          <w:rFonts w:ascii="Calibri" w:hAnsi="Calibri"/>
+          <w:b w:val="0"/>
+          <w:sz w:val="22"/>
+        </w:rPr>
+        <w:t>I am Saraswati Chetti, and I have come for {quantityLabel} of {spiceName} to fill my shop jars.</w:t>
       </w:r>
     </w:p>
     <w:p>
@@ -13054,7 +13189,7 @@
           <w:b w:val="0"/>
           <w:sz w:val="22"/>
         </w:rPr>
-        <w:t>Siddharth Chetti is here for {quantityLabel} of {spiceName}. Let us see what your stall offers.</w:t>
+        <w:t>Saraswati Chetti is here for {quantityLabel} of {spiceName}. Let us see what your stall offers.</w:t>
       </w:r>
     </w:p>
     <w:p>
@@ -16403,7 +16538,7 @@
           <w:b w:val="0"/>
           <w:sz w:val="22"/>
         </w:rPr>
-        <w:t>A Portuguese traveller and scholar moving through Hampi with curiosity about local life, hospitality, and exchange.</w:t>
+        <w:t>A Jesuit missionary and scholar travelling through Hampi with curiosity about local life, hospitality, and exchange.</w:t>
       </w:r>
     </w:p>
     <w:p>
@@ -16425,6 +16560,27 @@
           <w:sz w:val="22"/>
         </w:rPr>
         <w:t>Calm, observant, respectful, and thoughtful. He speaks gently and with interest in culture, travel, and learning.</w:t>
+      </w:r>
+    </w:p>
+    <w:p>
+      <w:pPr>
+        <w:spacing w:after="80"/>
+      </w:pPr>
+      <w:r>
+        <w:rPr>
+          <w:rFonts w:ascii="Calibri" w:hAnsi="Calibri"/>
+          <w:b/>
+          <w:sz w:val="22"/>
+        </w:rPr>
+        <w:t xml:space="preserve">Voice Direction: </w:t>
+      </w:r>
+      <w:r>
+        <w:rPr>
+          <w:rFonts w:ascii="Calibri" w:hAnsi="Calibri"/>
+          <w:b w:val="0"/>
+          <w:sz w:val="22"/>
+        </w:rPr>
+        <w:t>Male European or British-style voice.</w:t>
       </w:r>
     </w:p>
     <w:p>

</xml_diff>